<commit_message>
docs: check in FinalV1 submission rewrite and FinalV0 revisions
Co-Authored-By: Claude Opus 5 <noreply@anthropic.com>
</commit_message>
<xml_diff>
--- a/FinalV0/Overwatch_Idea_Submission.docx
+++ b/FinalV0/Overwatch_Idea_Submission.docx
@@ -68,15 +68,21 @@
         <w:rPr>
           <w:b/>
         </w:rPr>
-        <w:t>The Problem Statement We Were Given</w:t>
+        <w:t>Problem Statement</w:t>
       </w:r>
     </w:p>
     <w:p>
       <w:pPr>
-        <w:pStyle w:val="ListNumber"/>
         <w:spacing w:after="20"/>
-        <w:ind w:left="374"/>
-      </w:pPr>
+        <w:ind w:left="403"/>
+      </w:pPr>
+      <w:r>
+        <w:rPr>
+          <w:b/>
+          <w:sz w:val="22"/>
+        </w:rPr>
+        <w:t xml:space="preserve">1. </w:t>
+      </w:r>
       <w:r>
         <w:rPr>
           <w:b/>
@@ -87,10 +93,15 @@
     </w:p>
     <w:p>
       <w:pPr>
-        <w:pStyle w:val="ListNumber"/>
         <w:spacing w:after="20"/>
-        <w:ind w:left="662"/>
-      </w:pPr>
+        <w:ind w:left="778"/>
+      </w:pPr>
+      <w:r>
+        <w:rPr>
+          <w:sz w:val="22"/>
+        </w:rPr>
+        <w:t xml:space="preserve">1. </w:t>
+      </w:r>
       <w:r>
         <w:rPr>
           <w:sz w:val="22"/>
@@ -100,10 +111,15 @@
     </w:p>
     <w:p>
       <w:pPr>
-        <w:pStyle w:val="ListNumber"/>
         <w:spacing w:after="20"/>
-        <w:ind w:left="662"/>
-      </w:pPr>
+        <w:ind w:left="778"/>
+      </w:pPr>
+      <w:r>
+        <w:rPr>
+          <w:sz w:val="22"/>
+        </w:rPr>
+        <w:t xml:space="preserve">2. </w:t>
+      </w:r>
       <w:r>
         <w:rPr>
           <w:sz w:val="22"/>
@@ -113,10 +129,15 @@
     </w:p>
     <w:p>
       <w:pPr>
-        <w:pStyle w:val="ListNumber"/>
         <w:spacing w:after="20"/>
-        <w:ind w:left="662"/>
-      </w:pPr>
+        <w:ind w:left="778"/>
+      </w:pPr>
+      <w:r>
+        <w:rPr>
+          <w:sz w:val="22"/>
+        </w:rPr>
+        <w:t xml:space="preserve">3. </w:t>
+      </w:r>
       <w:r>
         <w:rPr>
           <w:sz w:val="22"/>
@@ -126,10 +147,15 @@
     </w:p>
     <w:p>
       <w:pPr>
-        <w:pStyle w:val="ListNumber"/>
         <w:spacing w:after="20"/>
-        <w:ind w:left="662"/>
-      </w:pPr>
+        <w:ind w:left="778"/>
+      </w:pPr>
+      <w:r>
+        <w:rPr>
+          <w:sz w:val="22"/>
+        </w:rPr>
+        <w:t xml:space="preserve">4. </w:t>
+      </w:r>
       <w:r>
         <w:rPr>
           <w:sz w:val="22"/>
@@ -139,10 +165,15 @@
     </w:p>
     <w:p>
       <w:pPr>
-        <w:pStyle w:val="ListNumber"/>
         <w:spacing w:after="20"/>
-        <w:ind w:left="662"/>
-      </w:pPr>
+        <w:ind w:left="778"/>
+      </w:pPr>
+      <w:r>
+        <w:rPr>
+          <w:sz w:val="22"/>
+        </w:rPr>
+        <w:t xml:space="preserve">5. </w:t>
+      </w:r>
       <w:r>
         <w:rPr>
           <w:sz w:val="22"/>
@@ -152,10 +183,15 @@
     </w:p>
     <w:p>
       <w:pPr>
-        <w:pStyle w:val="ListNumber"/>
         <w:spacing w:after="20"/>
-        <w:ind w:left="662"/>
-      </w:pPr>
+        <w:ind w:left="778"/>
+      </w:pPr>
+      <w:r>
+        <w:rPr>
+          <w:sz w:val="22"/>
+        </w:rPr>
+        <w:t xml:space="preserve">6. </w:t>
+      </w:r>
       <w:r>
         <w:rPr>
           <w:sz w:val="22"/>
@@ -165,10 +201,16 @@
     </w:p>
     <w:p>
       <w:pPr>
-        <w:pStyle w:val="ListNumber"/>
         <w:spacing w:after="20"/>
-        <w:ind w:left="374"/>
-      </w:pPr>
+        <w:ind w:left="403"/>
+      </w:pPr>
+      <w:r>
+        <w:rPr>
+          <w:b/>
+          <w:sz w:val="22"/>
+        </w:rPr>
+        <w:t xml:space="preserve">2. </w:t>
+      </w:r>
       <w:r>
         <w:rPr>
           <w:b/>
@@ -179,10 +221,15 @@
     </w:p>
     <w:p>
       <w:pPr>
-        <w:pStyle w:val="ListNumber"/>
         <w:spacing w:after="20"/>
-        <w:ind w:left="662"/>
-      </w:pPr>
+        <w:ind w:left="778"/>
+      </w:pPr>
+      <w:r>
+        <w:rPr>
+          <w:sz w:val="22"/>
+        </w:rPr>
+        <w:t xml:space="preserve">1. </w:t>
+      </w:r>
       <w:r>
         <w:rPr>
           <w:sz w:val="22"/>
@@ -192,10 +239,15 @@
     </w:p>
     <w:p>
       <w:pPr>
-        <w:pStyle w:val="ListNumber"/>
         <w:spacing w:after="20"/>
-        <w:ind w:left="662"/>
-      </w:pPr>
+        <w:ind w:left="778"/>
+      </w:pPr>
+      <w:r>
+        <w:rPr>
+          <w:sz w:val="22"/>
+        </w:rPr>
+        <w:t xml:space="preserve">2. </w:t>
+      </w:r>
       <w:r>
         <w:rPr>
           <w:sz w:val="22"/>
@@ -205,10 +257,15 @@
     </w:p>
     <w:p>
       <w:pPr>
-        <w:pStyle w:val="ListNumber"/>
         <w:spacing w:after="20"/>
-        <w:ind w:left="662"/>
-      </w:pPr>
+        <w:ind w:left="778"/>
+      </w:pPr>
+      <w:r>
+        <w:rPr>
+          <w:sz w:val="22"/>
+        </w:rPr>
+        <w:t xml:space="preserve">3. </w:t>
+      </w:r>
       <w:r>
         <w:rPr>
           <w:sz w:val="22"/>
@@ -218,10 +275,15 @@
     </w:p>
     <w:p>
       <w:pPr>
-        <w:pStyle w:val="ListNumber"/>
         <w:spacing w:after="20"/>
-        <w:ind w:left="662"/>
-      </w:pPr>
+        <w:ind w:left="778"/>
+      </w:pPr>
+      <w:r>
+        <w:rPr>
+          <w:sz w:val="22"/>
+        </w:rPr>
+        <w:t xml:space="preserve">4. </w:t>
+      </w:r>
       <w:r>
         <w:rPr>
           <w:sz w:val="22"/>
@@ -231,10 +293,16 @@
     </w:p>
     <w:p>
       <w:pPr>
-        <w:pStyle w:val="ListNumber"/>
         <w:spacing w:after="20"/>
-        <w:ind w:left="374"/>
-      </w:pPr>
+        <w:ind w:left="403"/>
+      </w:pPr>
+      <w:r>
+        <w:rPr>
+          <w:b/>
+          <w:sz w:val="22"/>
+        </w:rPr>
+        <w:t xml:space="preserve">3. </w:t>
+      </w:r>
       <w:r>
         <w:rPr>
           <w:b/>
@@ -245,10 +313,16 @@
     </w:p>
     <w:p>
       <w:pPr>
-        <w:pStyle w:val="ListNumber"/>
         <w:spacing w:after="20"/>
-        <w:ind w:left="374"/>
-      </w:pPr>
+        <w:ind w:left="403"/>
+      </w:pPr>
+      <w:r>
+        <w:rPr>
+          <w:b/>
+          <w:sz w:val="22"/>
+        </w:rPr>
+        <w:t xml:space="preserve">4. </w:t>
+      </w:r>
       <w:r>
         <w:rPr>
           <w:b/>
@@ -259,10 +333,15 @@
     </w:p>
     <w:p>
       <w:pPr>
-        <w:pStyle w:val="ListNumber"/>
         <w:spacing w:after="20"/>
-        <w:ind w:left="662"/>
-      </w:pPr>
+        <w:ind w:left="778"/>
+      </w:pPr>
+      <w:r>
+        <w:rPr>
+          <w:sz w:val="22"/>
+        </w:rPr>
+        <w:t xml:space="preserve">1. </w:t>
+      </w:r>
       <w:r>
         <w:rPr>
           <w:sz w:val="22"/>
@@ -272,10 +351,15 @@
     </w:p>
     <w:p>
       <w:pPr>
-        <w:pStyle w:val="ListNumber"/>
         <w:spacing w:after="20"/>
-        <w:ind w:left="662"/>
-      </w:pPr>
+        <w:ind w:left="778"/>
+      </w:pPr>
+      <w:r>
+        <w:rPr>
+          <w:sz w:val="22"/>
+        </w:rPr>
+        <w:t xml:space="preserve">2. </w:t>
+      </w:r>
       <w:r>
         <w:rPr>
           <w:sz w:val="22"/>
@@ -285,10 +369,15 @@
     </w:p>
     <w:p>
       <w:pPr>
-        <w:pStyle w:val="ListNumber"/>
         <w:spacing w:after="20"/>
-        <w:ind w:left="662"/>
-      </w:pPr>
+        <w:ind w:left="778"/>
+      </w:pPr>
+      <w:r>
+        <w:rPr>
+          <w:sz w:val="22"/>
+        </w:rPr>
+        <w:t xml:space="preserve">3. </w:t>
+      </w:r>
       <w:r>
         <w:rPr>
           <w:sz w:val="22"/>
@@ -298,10 +387,15 @@
     </w:p>
     <w:p>
       <w:pPr>
-        <w:pStyle w:val="ListNumber"/>
         <w:spacing w:after="20"/>
-        <w:ind w:left="662"/>
-      </w:pPr>
+        <w:ind w:left="778"/>
+      </w:pPr>
+      <w:r>
+        <w:rPr>
+          <w:sz w:val="22"/>
+        </w:rPr>
+        <w:t xml:space="preserve">4. </w:t>
+      </w:r>
       <w:r>
         <w:rPr>
           <w:sz w:val="22"/>
@@ -311,10 +405,15 @@
     </w:p>
     <w:p>
       <w:pPr>
-        <w:pStyle w:val="ListNumber"/>
         <w:spacing w:after="20"/>
-        <w:ind w:left="662"/>
-      </w:pPr>
+        <w:ind w:left="778"/>
+      </w:pPr>
+      <w:r>
+        <w:rPr>
+          <w:sz w:val="22"/>
+        </w:rPr>
+        <w:t xml:space="preserve">5. </w:t>
+      </w:r>
       <w:r>
         <w:rPr>
           <w:sz w:val="22"/>
@@ -324,10 +423,15 @@
     </w:p>
     <w:p>
       <w:pPr>
-        <w:pStyle w:val="ListNumber"/>
         <w:spacing w:after="20"/>
-        <w:ind w:left="662"/>
-      </w:pPr>
+        <w:ind w:left="778"/>
+      </w:pPr>
+      <w:r>
+        <w:rPr>
+          <w:sz w:val="22"/>
+        </w:rPr>
+        <w:t xml:space="preserve">6. </w:t>
+      </w:r>
       <w:r>
         <w:rPr>
           <w:sz w:val="22"/>
@@ -337,10 +441,15 @@
     </w:p>
     <w:p>
       <w:pPr>
-        <w:pStyle w:val="ListNumber"/>
         <w:spacing w:after="20"/>
-        <w:ind w:left="662"/>
-      </w:pPr>
+        <w:ind w:left="778"/>
+      </w:pPr>
+      <w:r>
+        <w:rPr>
+          <w:sz w:val="22"/>
+        </w:rPr>
+        <w:t xml:space="preserve">7. </w:t>
+      </w:r>
       <w:r>
         <w:rPr>
           <w:sz w:val="22"/>
@@ -350,10 +459,15 @@
     </w:p>
     <w:p>
       <w:pPr>
-        <w:pStyle w:val="ListNumber"/>
         <w:spacing w:after="20"/>
-        <w:ind w:left="662"/>
-      </w:pPr>
+        <w:ind w:left="778"/>
+      </w:pPr>
+      <w:r>
+        <w:rPr>
+          <w:sz w:val="22"/>
+        </w:rPr>
+        <w:t xml:space="preserve">8. </w:t>
+      </w:r>
       <w:r>
         <w:rPr>
           <w:sz w:val="22"/>
@@ -363,10 +477,15 @@
     </w:p>
     <w:p>
       <w:pPr>
-        <w:pStyle w:val="ListNumber"/>
         <w:spacing w:after="20"/>
-        <w:ind w:left="662"/>
-      </w:pPr>
+        <w:ind w:left="778"/>
+      </w:pPr>
+      <w:r>
+        <w:rPr>
+          <w:sz w:val="22"/>
+        </w:rPr>
+        <w:t xml:space="preserve">9. </w:t>
+      </w:r>
       <w:r>
         <w:rPr>
           <w:sz w:val="22"/>
@@ -376,10 +495,16 @@
     </w:p>
     <w:p>
       <w:pPr>
-        <w:pStyle w:val="ListNumber"/>
         <w:spacing w:after="20"/>
-        <w:ind w:left="374"/>
-      </w:pPr>
+        <w:ind w:left="403"/>
+      </w:pPr>
+      <w:r>
+        <w:rPr>
+          <w:b/>
+          <w:sz w:val="22"/>
+        </w:rPr>
+        <w:t xml:space="preserve">5. </w:t>
+      </w:r>
       <w:r>
         <w:rPr>
           <w:b/>
@@ -390,10 +515,15 @@
     </w:p>
     <w:p>
       <w:pPr>
-        <w:pStyle w:val="ListNumber"/>
         <w:spacing w:after="20"/>
-        <w:ind w:left="662"/>
-      </w:pPr>
+        <w:ind w:left="778"/>
+      </w:pPr>
+      <w:r>
+        <w:rPr>
+          <w:sz w:val="22"/>
+        </w:rPr>
+        <w:t xml:space="preserve">1. </w:t>
+      </w:r>
       <w:r>
         <w:rPr>
           <w:sz w:val="22"/>
@@ -403,10 +533,15 @@
     </w:p>
     <w:p>
       <w:pPr>
-        <w:pStyle w:val="ListNumber"/>
         <w:spacing w:after="20"/>
-        <w:ind w:left="662"/>
-      </w:pPr>
+        <w:ind w:left="778"/>
+      </w:pPr>
+      <w:r>
+        <w:rPr>
+          <w:sz w:val="22"/>
+        </w:rPr>
+        <w:t xml:space="preserve">2. </w:t>
+      </w:r>
       <w:r>
         <w:rPr>
           <w:sz w:val="22"/>
@@ -416,10 +551,15 @@
     </w:p>
     <w:p>
       <w:pPr>
-        <w:pStyle w:val="ListNumber"/>
         <w:spacing w:after="20"/>
-        <w:ind w:left="662"/>
-      </w:pPr>
+        <w:ind w:left="778"/>
+      </w:pPr>
+      <w:r>
+        <w:rPr>
+          <w:sz w:val="22"/>
+        </w:rPr>
+        <w:t xml:space="preserve">3. </w:t>
+      </w:r>
       <w:r>
         <w:rPr>
           <w:sz w:val="22"/>
@@ -429,10 +569,16 @@
     </w:p>
     <w:p>
       <w:pPr>
-        <w:pStyle w:val="ListNumber"/>
         <w:spacing w:after="20"/>
-        <w:ind w:left="374"/>
-      </w:pPr>
+        <w:ind w:left="403"/>
+      </w:pPr>
+      <w:r>
+        <w:rPr>
+          <w:b/>
+          <w:sz w:val="22"/>
+        </w:rPr>
+        <w:t xml:space="preserve">6. </w:t>
+      </w:r>
       <w:r>
         <w:rPr>
           <w:b/>
@@ -443,10 +589,15 @@
     </w:p>
     <w:p>
       <w:pPr>
-        <w:pStyle w:val="ListNumber"/>
         <w:spacing w:after="20"/>
-        <w:ind w:left="662"/>
-      </w:pPr>
+        <w:ind w:left="778"/>
+      </w:pPr>
+      <w:r>
+        <w:rPr>
+          <w:sz w:val="22"/>
+        </w:rPr>
+        <w:t xml:space="preserve">1. </w:t>
+      </w:r>
       <w:r>
         <w:rPr>
           <w:sz w:val="22"/>
@@ -456,10 +607,15 @@
     </w:p>
     <w:p>
       <w:pPr>
-        <w:pStyle w:val="ListNumber"/>
         <w:spacing w:after="20"/>
-        <w:ind w:left="662"/>
-      </w:pPr>
+        <w:ind w:left="778"/>
+      </w:pPr>
+      <w:r>
+        <w:rPr>
+          <w:sz w:val="22"/>
+        </w:rPr>
+        <w:t xml:space="preserve">2. </w:t>
+      </w:r>
       <w:r>
         <w:rPr>
           <w:sz w:val="22"/>
@@ -469,10 +625,16 @@
     </w:p>
     <w:p>
       <w:pPr>
-        <w:pStyle w:val="ListNumber"/>
         <w:spacing w:after="20"/>
-        <w:ind w:left="374"/>
-      </w:pPr>
+        <w:ind w:left="403"/>
+      </w:pPr>
+      <w:r>
+        <w:rPr>
+          <w:b/>
+          <w:sz w:val="22"/>
+        </w:rPr>
+        <w:t xml:space="preserve">7. </w:t>
+      </w:r>
       <w:r>
         <w:rPr>
           <w:b/>
@@ -483,10 +645,16 @@
     </w:p>
     <w:p>
       <w:pPr>
-        <w:pStyle w:val="ListNumber"/>
         <w:spacing w:after="20"/>
-        <w:ind w:left="374"/>
-      </w:pPr>
+        <w:ind w:left="403"/>
+      </w:pPr>
+      <w:r>
+        <w:rPr>
+          <w:b/>
+          <w:sz w:val="22"/>
+        </w:rPr>
+        <w:t xml:space="preserve">8. </w:t>
+      </w:r>
       <w:r>
         <w:rPr>
           <w:b/>
@@ -497,10 +665,16 @@
     </w:p>
     <w:p>
       <w:pPr>
-        <w:pStyle w:val="ListNumber"/>
         <w:spacing w:after="20"/>
-        <w:ind w:left="374"/>
-      </w:pPr>
+        <w:ind w:left="403"/>
+      </w:pPr>
+      <w:r>
+        <w:rPr>
+          <w:b/>
+          <w:sz w:val="22"/>
+        </w:rPr>
+        <w:t xml:space="preserve">9. </w:t>
+      </w:r>
       <w:r>
         <w:rPr>
           <w:b/>
@@ -511,10 +685,16 @@
     </w:p>
     <w:p>
       <w:pPr>
-        <w:pStyle w:val="ListNumber"/>
         <w:spacing w:after="20"/>
-        <w:ind w:left="374"/>
-      </w:pPr>
+        <w:ind w:left="403"/>
+      </w:pPr>
+      <w:r>
+        <w:rPr>
+          <w:b/>
+          <w:sz w:val="22"/>
+        </w:rPr>
+        <w:t xml:space="preserve">10. </w:t>
+      </w:r>
       <w:r>
         <w:rPr>
           <w:b/>
@@ -525,10 +705,16 @@
     </w:p>
     <w:p>
       <w:pPr>
-        <w:pStyle w:val="ListNumber"/>
         <w:spacing w:after="20"/>
-        <w:ind w:left="374"/>
-      </w:pPr>
+        <w:ind w:left="403"/>
+      </w:pPr>
+      <w:r>
+        <w:rPr>
+          <w:b/>
+          <w:sz w:val="22"/>
+        </w:rPr>
+        <w:t xml:space="preserve">11. </w:t>
+      </w:r>
       <w:r>
         <w:rPr>
           <w:b/>
@@ -539,10 +725,16 @@
     </w:p>
     <w:p>
       <w:pPr>
-        <w:pStyle w:val="ListNumber"/>
         <w:spacing w:after="20"/>
-        <w:ind w:left="374"/>
-      </w:pPr>
+        <w:ind w:left="403"/>
+      </w:pPr>
+      <w:r>
+        <w:rPr>
+          <w:b/>
+          <w:sz w:val="22"/>
+        </w:rPr>
+        <w:t xml:space="preserve">12. </w:t>
+      </w:r>
       <w:r>
         <w:rPr>
           <w:b/>
@@ -552,6 +744,11 @@
       </w:r>
     </w:p>
     <w:p>
+      <w:r>
+        <w:br w:type="page"/>
+      </w:r>
+    </w:p>
+    <w:p>
       <w:pPr>
         <w:keepNext/>
         <w:spacing w:before="100" w:after="40"/>
@@ -565,7 +762,7 @@
           <w:color w:val="1A1A1A"/>
           <w:sz w:val="30"/>
         </w:rPr>
-        <w:t>The Problem Statement We Were Given</w:t>
+        <w:t>Problem Statement</w:t>
       </w:r>
     </w:p>
     <w:p>
@@ -595,7 +792,7 @@
           <w:b/>
           <w:sz w:val="23"/>
         </w:rPr>
-        <w:t>The brief:</w:t>
+        <w:t>The scope:</w:t>
       </w:r>
       <w:r>
         <w:rPr>

</xml_diff>